<commit_message>
feat(portfolio): add Axios to skills section
</commit_message>
<xml_diff>
--- a/public/documents/Resume_Mike_Vorobyev.docx
+++ b/public/documents/Resume_Mike_Vorobyev.docx
@@ -1465,6 +1465,52 @@
           <w:shd w:val="clear" w:color="auto" w:fill="FFFFFF"/>
           <w:lang w:val="en-US"/>
         </w:rPr>
+        <w:t>Axios</w:t>
+      </w:r>
+      <w:proofErr w:type="spellEnd"/>
+      <w:r>
+        <w:rPr>
+          <w:rFonts w:ascii="Arial" w:hAnsi="Arial" w:cs="Arial"/>
+          <w:color w:val="000000"/>
+          <w:sz w:val="32"/>
+          <w:szCs w:val="32"/>
+          <w:shd w:val="clear" w:color="auto" w:fill="FFFFFF"/>
+          <w:lang w:val="en-US"/>
+        </w:rPr>
+        <w:t xml:space="preserve"> </w:t>
+      </w:r>
+      <w:r>
+        <w:rPr>
+          <w:rFonts w:ascii="Arial" w:hAnsi="Arial" w:cs="Arial"/>
+          <w:color w:val="000000"/>
+          <w:sz w:val="32"/>
+          <w:szCs w:val="32"/>
+          <w:shd w:val="clear" w:color="auto" w:fill="FFFFFF"/>
+          <w:lang w:val="en-US"/>
+        </w:rPr>
+        <w:t>•</w:t>
+      </w:r>
+      <w:r>
+        <w:rPr>
+          <w:rFonts w:ascii="Arial" w:hAnsi="Arial" w:cs="Arial"/>
+          <w:color w:val="000000"/>
+          <w:sz w:val="32"/>
+          <w:szCs w:val="32"/>
+          <w:shd w:val="clear" w:color="auto" w:fill="FFFFFF"/>
+          <w:lang w:val="en-US"/>
+        </w:rPr>
+        <w:t xml:space="preserve"> </w:t>
+      </w:r>
+      <w:proofErr w:type="spellStart"/>
+      <w:r>
+        <w:rPr>
+          <w:rFonts w:ascii="Arial" w:hAnsi="Arial" w:cs="Arial"/>
+          <w:color w:val="000000"/>
+          <w:sz w:val="32"/>
+          <w:szCs w:val="32"/>
+          <w:shd w:val="clear" w:color="auto" w:fill="FFFFFF"/>
+          <w:lang w:val="en-US"/>
+        </w:rPr>
         <w:t>Redux</w:t>
       </w:r>
       <w:proofErr w:type="spellEnd"/>
@@ -1638,960 +1684,1015 @@
           <w:lang w:val="en-US"/>
         </w:rPr>
       </w:pPr>
+    </w:p>
+    <w:p>
+      <w:pPr>
+        <w:pStyle w:val="a3"/>
+        <w:spacing w:after="0"/>
+        <w:textAlignment w:val="baseline"/>
+        <w:rPr>
+          <w:rFonts w:ascii="Arial" w:hAnsi="Arial" w:cs="Arial"/>
+          <w:sz w:val="32"/>
+          <w:szCs w:val="32"/>
+          <w:lang w:val="en-US"/>
+        </w:rPr>
+      </w:pPr>
+    </w:p>
+    <w:p>
+      <w:pPr>
+        <w:pStyle w:val="a3"/>
+        <w:spacing w:after="0"/>
+        <w:textAlignment w:val="baseline"/>
+        <w:rPr>
+          <w:rFonts w:ascii="Arial" w:hAnsi="Arial" w:cs="Arial"/>
+          <w:sz w:val="32"/>
+          <w:szCs w:val="32"/>
+          <w:lang w:val="en-US"/>
+        </w:rPr>
+      </w:pPr>
+    </w:p>
+    <w:p>
+      <w:pPr>
+        <w:pStyle w:val="a3"/>
+        <w:spacing w:after="0"/>
+        <w:textAlignment w:val="baseline"/>
+        <w:rPr>
+          <w:rFonts w:ascii="Arial" w:hAnsi="Arial" w:cs="Arial"/>
+          <w:sz w:val="32"/>
+          <w:szCs w:val="32"/>
+          <w:lang w:val="en-US"/>
+        </w:rPr>
+      </w:pPr>
+      <w:r>
+        <w:rPr>
+          <w:rFonts w:ascii="Arial" w:hAnsi="Arial" w:cs="Arial"/>
+          <w:sz w:val="32"/>
+          <w:szCs w:val="32"/>
+          <w:lang w:val="en-US"/>
+        </w:rPr>
+        <w:lastRenderedPageBreak/>
+        <w:t>About Me (English Version)</w:t>
+      </w:r>
+    </w:p>
+    <w:p>
+      <w:pPr>
+        <w:pStyle w:val="a3"/>
+        <w:spacing w:after="0"/>
+        <w:textAlignment w:val="baseline"/>
+        <w:rPr>
+          <w:rFonts w:ascii="Arial" w:hAnsi="Arial" w:cs="Arial"/>
+          <w:sz w:val="32"/>
+          <w:szCs w:val="32"/>
+          <w:lang w:val="en-US"/>
+        </w:rPr>
+      </w:pPr>
+      <w:r>
+        <w:rPr>
+          <w:rFonts w:ascii="Arial" w:hAnsi="Arial" w:cs="Arial"/>
+          <w:sz w:val="32"/>
+          <w:szCs w:val="32"/>
+          <w:lang w:val="en-US"/>
+        </w:rPr>
+        <w:t>Before Web Development:</w:t>
+      </w:r>
+    </w:p>
+    <w:p>
+      <w:pPr>
+        <w:pStyle w:val="a3"/>
+        <w:textAlignment w:val="baseline"/>
+        <w:rPr>
+          <w:rFonts w:ascii="Arial" w:hAnsi="Arial" w:cs="Arial"/>
+          <w:sz w:val="32"/>
+          <w:szCs w:val="32"/>
+          <w:lang w:val="en-US"/>
+        </w:rPr>
+      </w:pPr>
+      <w:r>
+        <w:rPr>
+          <w:rFonts w:ascii="Arial" w:hAnsi="Arial" w:cs="Arial"/>
+          <w:sz w:val="32"/>
+          <w:szCs w:val="32"/>
+          <w:lang w:val="en-US"/>
+        </w:rPr>
+        <w:t>Graduated from the Lvov Cultural College. Worked as a guitar teacher at a Children's Art School. Later moved to the House of Culture as a sound engineer — handled sound for events and started editing videos on the side.</w:t>
+      </w:r>
+    </w:p>
+    <w:p>
+      <w:pPr>
+        <w:pStyle w:val="a3"/>
+        <w:spacing w:after="0"/>
+        <w:textAlignment w:val="baseline"/>
+        <w:rPr>
+          <w:rFonts w:ascii="Arial" w:hAnsi="Arial" w:cs="Arial"/>
+          <w:sz w:val="32"/>
+          <w:szCs w:val="32"/>
+          <w:lang w:val="en-US"/>
+        </w:rPr>
+      </w:pPr>
+    </w:p>
+    <w:p>
+      <w:pPr>
+        <w:pStyle w:val="a3"/>
+        <w:spacing w:after="0"/>
+        <w:textAlignment w:val="baseline"/>
+        <w:rPr>
+          <w:rFonts w:ascii="Arial" w:hAnsi="Arial" w:cs="Arial"/>
+          <w:sz w:val="32"/>
+          <w:szCs w:val="32"/>
+          <w:lang w:val="en-US"/>
+        </w:rPr>
+      </w:pPr>
+      <w:r>
+        <w:rPr>
+          <w:rFonts w:ascii="Arial" w:hAnsi="Arial" w:cs="Arial"/>
+          <w:sz w:val="32"/>
+          <w:szCs w:val="32"/>
+          <w:lang w:val="en-US"/>
+        </w:rPr>
+        <w:t>During this period, I also began composing music for stock audio platforms (AudioJingle), working as a composer. My music was used on YouTube, television, and other media outlets. Competition turned out to be too high, so music composition remained a hobby.</w:t>
+      </w:r>
+    </w:p>
+    <w:p>
+      <w:pPr>
+        <w:pStyle w:val="a3"/>
+        <w:spacing w:after="0"/>
+        <w:textAlignment w:val="baseline"/>
+        <w:rPr>
+          <w:rFonts w:ascii="Arial" w:hAnsi="Arial" w:cs="Arial"/>
+          <w:sz w:val="32"/>
+          <w:szCs w:val="32"/>
+          <w:lang w:val="en-US"/>
+        </w:rPr>
+      </w:pPr>
+    </w:p>
+    <w:p>
+      <w:pPr>
+        <w:pStyle w:val="a3"/>
+        <w:spacing w:after="0"/>
+        <w:textAlignment w:val="baseline"/>
+        <w:rPr>
+          <w:rFonts w:ascii="Arial" w:hAnsi="Arial" w:cs="Arial"/>
+          <w:sz w:val="32"/>
+          <w:szCs w:val="32"/>
+          <w:lang w:val="en-US"/>
+        </w:rPr>
+      </w:pPr>
+      <w:r>
+        <w:rPr>
+          <w:rFonts w:ascii="Arial" w:hAnsi="Arial" w:cs="Arial"/>
+          <w:sz w:val="32"/>
+          <w:szCs w:val="32"/>
+          <w:lang w:val="en-US"/>
+        </w:rPr>
+        <w:t>After the House of Culture, I worked as a layout designer at a local newspaper — handled the layout for every issue. Later returned to the House of Culture as a video editor. Simultaneously took freelance projects from the local Administration: video projects, intros, promos. Registered as self-employed in two fields — video editing and composing.</w:t>
+      </w:r>
+    </w:p>
+    <w:p>
+      <w:pPr>
+        <w:pStyle w:val="a3"/>
+        <w:spacing w:after="0"/>
+        <w:textAlignment w:val="baseline"/>
+        <w:rPr>
+          <w:rFonts w:ascii="Arial" w:hAnsi="Arial" w:cs="Arial"/>
+          <w:sz w:val="32"/>
+          <w:szCs w:val="32"/>
+          <w:lang w:val="en-US"/>
+        </w:rPr>
+      </w:pPr>
+    </w:p>
+    <w:p>
+      <w:pPr>
+        <w:pStyle w:val="a3"/>
+        <w:spacing w:after="0"/>
+        <w:textAlignment w:val="baseline"/>
+        <w:rPr>
+          <w:rFonts w:ascii="Arial" w:hAnsi="Arial" w:cs="Arial"/>
+          <w:sz w:val="32"/>
+          <w:szCs w:val="32"/>
+          <w:lang w:val="en-US"/>
+        </w:rPr>
+      </w:pPr>
+      <w:r>
+        <w:rPr>
+          <w:rFonts w:ascii="Arial" w:hAnsi="Arial" w:cs="Arial"/>
+          <w:sz w:val="32"/>
+          <w:szCs w:val="32"/>
+          <w:lang w:val="en-US"/>
+        </w:rPr>
+        <w:t>Notable projects:</w:t>
+      </w:r>
+    </w:p>
+    <w:p>
+      <w:pPr>
+        <w:pStyle w:val="a3"/>
+        <w:spacing w:after="0"/>
+        <w:textAlignment w:val="baseline"/>
+        <w:rPr>
+          <w:rFonts w:ascii="Arial" w:hAnsi="Arial" w:cs="Arial"/>
+          <w:sz w:val="32"/>
+          <w:szCs w:val="32"/>
+          <w:lang w:val="en-US"/>
+        </w:rPr>
+      </w:pPr>
+    </w:p>
+    <w:p>
+      <w:pPr>
+        <w:pStyle w:val="a3"/>
+        <w:spacing w:after="0"/>
+        <w:textAlignment w:val="baseline"/>
+        <w:rPr>
+          <w:rFonts w:ascii="Arial" w:hAnsi="Arial" w:cs="Arial"/>
+          <w:sz w:val="32"/>
+          <w:szCs w:val="32"/>
+          <w:lang w:val="en-US"/>
+        </w:rPr>
+      </w:pPr>
+      <w:r>
+        <w:rPr>
+          <w:rFonts w:ascii="Arial" w:hAnsi="Arial" w:cs="Arial"/>
+          <w:sz w:val="32"/>
+          <w:szCs w:val="32"/>
+          <w:lang w:val="en-US"/>
+        </w:rPr>
+        <w:t>Full video production for the Karelian culture festival "</w:t>
+      </w:r>
+      <w:proofErr w:type="spellStart"/>
+      <w:r>
+        <w:rPr>
+          <w:rFonts w:ascii="Arial" w:hAnsi="Arial" w:cs="Arial"/>
+          <w:sz w:val="32"/>
+          <w:szCs w:val="32"/>
+          <w:lang w:val="en-US"/>
+        </w:rPr>
+        <w:t>Oma</w:t>
+      </w:r>
+      <w:proofErr w:type="spellEnd"/>
+      <w:r>
+        <w:rPr>
+          <w:rFonts w:ascii="Arial" w:hAnsi="Arial" w:cs="Arial"/>
+          <w:sz w:val="32"/>
+          <w:szCs w:val="32"/>
+          <w:lang w:val="en-US"/>
+        </w:rPr>
+        <w:t xml:space="preserve"> </w:t>
+      </w:r>
+      <w:proofErr w:type="spellStart"/>
+      <w:r>
+        <w:rPr>
+          <w:rFonts w:ascii="Arial" w:hAnsi="Arial" w:cs="Arial"/>
+          <w:sz w:val="32"/>
+          <w:szCs w:val="32"/>
+          <w:lang w:val="en-US"/>
+        </w:rPr>
+        <w:t>Randa</w:t>
+      </w:r>
+      <w:proofErr w:type="spellEnd"/>
+      <w:r>
+        <w:rPr>
+          <w:rFonts w:ascii="Arial" w:hAnsi="Arial" w:cs="Arial"/>
+          <w:sz w:val="32"/>
+          <w:szCs w:val="32"/>
+          <w:lang w:val="en-US"/>
+        </w:rPr>
+        <w:t>" (editing videos with 3D integration in Cinema 4D, arranging the anthem)</w:t>
+      </w:r>
+    </w:p>
+    <w:p>
+      <w:pPr>
+        <w:pStyle w:val="a3"/>
+        <w:spacing w:after="0"/>
+        <w:textAlignment w:val="baseline"/>
+        <w:rPr>
+          <w:rFonts w:ascii="Arial" w:hAnsi="Arial" w:cs="Arial"/>
+          <w:sz w:val="32"/>
+          <w:szCs w:val="32"/>
+          <w:lang w:val="en-US"/>
+        </w:rPr>
+      </w:pPr>
+    </w:p>
+    <w:p>
+      <w:pPr>
+        <w:pStyle w:val="a3"/>
+        <w:spacing w:after="0"/>
+        <w:textAlignment w:val="baseline"/>
+        <w:rPr>
+          <w:rFonts w:ascii="Arial" w:hAnsi="Arial" w:cs="Arial"/>
+          <w:sz w:val="32"/>
+          <w:szCs w:val="32"/>
+          <w:lang w:val="en-US"/>
+        </w:rPr>
+      </w:pPr>
+      <w:r>
+        <w:rPr>
+          <w:rFonts w:ascii="Arial" w:hAnsi="Arial" w:cs="Arial"/>
+          <w:sz w:val="32"/>
+          <w:szCs w:val="32"/>
+          <w:lang w:val="en-US"/>
+        </w:rPr>
+        <w:t>Created an animated 3D intro for the children's show "</w:t>
+      </w:r>
+      <w:proofErr w:type="spellStart"/>
+      <w:r>
+        <w:rPr>
+          <w:rFonts w:ascii="Arial" w:hAnsi="Arial" w:cs="Arial"/>
+          <w:sz w:val="32"/>
+          <w:szCs w:val="32"/>
+          <w:lang w:val="en-US"/>
+        </w:rPr>
+        <w:t>Vse</w:t>
+      </w:r>
+      <w:proofErr w:type="spellEnd"/>
+      <w:r>
+        <w:rPr>
+          <w:rFonts w:ascii="Arial" w:hAnsi="Arial" w:cs="Arial"/>
+          <w:sz w:val="32"/>
+          <w:szCs w:val="32"/>
+          <w:lang w:val="en-US"/>
+        </w:rPr>
+        <w:t xml:space="preserve"> obo </w:t>
+      </w:r>
+      <w:proofErr w:type="spellStart"/>
+      <w:r>
+        <w:rPr>
+          <w:rFonts w:ascii="Arial" w:hAnsi="Arial" w:cs="Arial"/>
+          <w:sz w:val="32"/>
+          <w:szCs w:val="32"/>
+          <w:lang w:val="en-US"/>
+        </w:rPr>
+        <w:t>vsem</w:t>
+      </w:r>
+      <w:proofErr w:type="spellEnd"/>
+      <w:r>
+        <w:rPr>
+          <w:rFonts w:ascii="Arial" w:hAnsi="Arial" w:cs="Arial"/>
+          <w:sz w:val="32"/>
+          <w:szCs w:val="32"/>
+          <w:lang w:val="en-US"/>
+        </w:rPr>
+        <w:t>"</w:t>
+      </w:r>
+    </w:p>
+    <w:p>
+      <w:pPr>
+        <w:pStyle w:val="a3"/>
+        <w:spacing w:after="0"/>
+        <w:textAlignment w:val="baseline"/>
+        <w:rPr>
+          <w:rFonts w:ascii="Arial" w:hAnsi="Arial" w:cs="Arial"/>
+          <w:sz w:val="32"/>
+          <w:szCs w:val="32"/>
+          <w:lang w:val="en-US"/>
+        </w:rPr>
+      </w:pPr>
+    </w:p>
+    <w:p>
+      <w:pPr>
+        <w:pStyle w:val="a3"/>
+        <w:spacing w:after="0"/>
+        <w:textAlignment w:val="baseline"/>
+        <w:rPr>
+          <w:rFonts w:ascii="Arial" w:hAnsi="Arial" w:cs="Arial"/>
+          <w:sz w:val="32"/>
+          <w:szCs w:val="32"/>
+          <w:lang w:val="en-US"/>
+        </w:rPr>
+      </w:pPr>
+      <w:r>
+        <w:rPr>
+          <w:rFonts w:ascii="Arial" w:hAnsi="Arial" w:cs="Arial"/>
+          <w:sz w:val="32"/>
+          <w:szCs w:val="32"/>
+          <w:lang w:val="en-US"/>
+        </w:rPr>
+        <w:t>Path into IT:</w:t>
+      </w:r>
+    </w:p>
+    <w:p>
+      <w:pPr>
+        <w:pStyle w:val="a3"/>
+        <w:spacing w:after="0"/>
+        <w:textAlignment w:val="baseline"/>
+        <w:rPr>
+          <w:rFonts w:ascii="Arial" w:hAnsi="Arial" w:cs="Arial"/>
+          <w:sz w:val="32"/>
+          <w:szCs w:val="32"/>
+          <w:lang w:val="en-US"/>
+        </w:rPr>
+      </w:pPr>
+      <w:r>
+        <w:rPr>
+          <w:rFonts w:ascii="Arial" w:hAnsi="Arial" w:cs="Arial"/>
+          <w:sz w:val="32"/>
+          <w:szCs w:val="32"/>
+          <w:lang w:val="en-US"/>
+        </w:rPr>
+        <w:t>Started with HTML and CSS on Code Basics. Took a one-year break due to workload at my main job. Returned to JavaScript on the same platform, then continued self-study: YouTube, online courses, coding along with instructors.</w:t>
+      </w:r>
+    </w:p>
+    <w:p>
+      <w:pPr>
+        <w:pStyle w:val="a3"/>
+        <w:spacing w:after="0"/>
+        <w:textAlignment w:val="baseline"/>
+        <w:rPr>
+          <w:rFonts w:ascii="Arial" w:hAnsi="Arial" w:cs="Arial"/>
+          <w:sz w:val="32"/>
+          <w:szCs w:val="32"/>
+          <w:lang w:val="en-US"/>
+        </w:rPr>
+      </w:pPr>
+    </w:p>
+    <w:p>
+      <w:pPr>
+        <w:pStyle w:val="a3"/>
+        <w:spacing w:after="0"/>
+        <w:textAlignment w:val="baseline"/>
+        <w:rPr>
+          <w:rFonts w:ascii="Arial" w:hAnsi="Arial" w:cs="Arial"/>
+          <w:sz w:val="32"/>
+          <w:szCs w:val="32"/>
+          <w:lang w:val="en-US"/>
+        </w:rPr>
+      </w:pPr>
+      <w:r>
+        <w:rPr>
+          <w:rFonts w:ascii="Arial" w:hAnsi="Arial" w:cs="Arial"/>
+          <w:sz w:val="32"/>
+          <w:szCs w:val="32"/>
+          <w:lang w:val="en-US"/>
+        </w:rPr>
+        <w:t xml:space="preserve">Tried Rolling Scopes School — my skills weren't sufficient at the time, so I focused on practice. Gradually worked my way up to React, </w:t>
+      </w:r>
+      <w:proofErr w:type="spellStart"/>
+      <w:r>
+        <w:rPr>
+          <w:rFonts w:ascii="Arial" w:hAnsi="Arial" w:cs="Arial"/>
+          <w:sz w:val="32"/>
+          <w:szCs w:val="32"/>
+          <w:lang w:val="en-US"/>
+        </w:rPr>
+        <w:t>TypeScript</w:t>
+      </w:r>
+      <w:proofErr w:type="spellEnd"/>
+      <w:r>
+        <w:rPr>
+          <w:rFonts w:ascii="Arial" w:hAnsi="Arial" w:cs="Arial"/>
+          <w:sz w:val="32"/>
+          <w:szCs w:val="32"/>
+          <w:lang w:val="en-US"/>
+        </w:rPr>
+        <w:t xml:space="preserve">, </w:t>
+      </w:r>
+      <w:proofErr w:type="spellStart"/>
+      <w:r>
+        <w:rPr>
+          <w:rFonts w:ascii="Arial" w:hAnsi="Arial" w:cs="Arial"/>
+          <w:sz w:val="32"/>
+          <w:szCs w:val="32"/>
+          <w:lang w:val="en-US"/>
+        </w:rPr>
+        <w:t>Zustand</w:t>
+      </w:r>
+      <w:proofErr w:type="spellEnd"/>
+      <w:r>
+        <w:rPr>
+          <w:rFonts w:ascii="Arial" w:hAnsi="Arial" w:cs="Arial"/>
+          <w:sz w:val="32"/>
+          <w:szCs w:val="32"/>
+          <w:lang w:val="en-US"/>
+        </w:rPr>
+        <w:t xml:space="preserve">, </w:t>
+      </w:r>
+      <w:proofErr w:type="spellStart"/>
+      <w:r>
+        <w:rPr>
+          <w:rFonts w:ascii="Arial" w:hAnsi="Arial" w:cs="Arial"/>
+          <w:sz w:val="32"/>
+          <w:szCs w:val="32"/>
+          <w:lang w:val="en-US"/>
+        </w:rPr>
+        <w:t>Redux</w:t>
+      </w:r>
+      <w:proofErr w:type="spellEnd"/>
+      <w:r>
+        <w:rPr>
+          <w:rFonts w:ascii="Arial" w:hAnsi="Arial" w:cs="Arial"/>
+          <w:sz w:val="32"/>
+          <w:szCs w:val="32"/>
+          <w:lang w:val="en-US"/>
+        </w:rPr>
+        <w:t xml:space="preserve"> Toolkit. Simultaneously solved problems on </w:t>
+      </w:r>
+      <w:proofErr w:type="spellStart"/>
+      <w:r>
+        <w:rPr>
+          <w:rFonts w:ascii="Arial" w:hAnsi="Arial" w:cs="Arial"/>
+          <w:sz w:val="32"/>
+          <w:szCs w:val="32"/>
+          <w:lang w:val="en-US"/>
+        </w:rPr>
+        <w:t>Codewars</w:t>
+      </w:r>
+      <w:proofErr w:type="spellEnd"/>
+      <w:r>
+        <w:rPr>
+          <w:rFonts w:ascii="Arial" w:hAnsi="Arial" w:cs="Arial"/>
+          <w:sz w:val="32"/>
+          <w:szCs w:val="32"/>
+          <w:lang w:val="en-US"/>
+        </w:rPr>
+        <w:t>.</w:t>
+      </w:r>
+    </w:p>
+    <w:p>
+      <w:pPr>
+        <w:pStyle w:val="a3"/>
+        <w:spacing w:after="0"/>
+        <w:textAlignment w:val="baseline"/>
+        <w:rPr>
+          <w:rFonts w:ascii="Arial" w:hAnsi="Arial" w:cs="Arial"/>
+          <w:sz w:val="32"/>
+          <w:szCs w:val="32"/>
+          <w:lang w:val="en-US"/>
+        </w:rPr>
+      </w:pPr>
+    </w:p>
+    <w:p>
+      <w:pPr>
+        <w:pStyle w:val="a3"/>
+        <w:spacing w:after="0"/>
+        <w:textAlignment w:val="baseline"/>
+        <w:rPr>
+          <w:rFonts w:ascii="Arial" w:hAnsi="Arial" w:cs="Arial"/>
+          <w:sz w:val="32"/>
+          <w:szCs w:val="32"/>
+          <w:lang w:val="en-US"/>
+        </w:rPr>
+      </w:pPr>
+      <w:r>
+        <w:rPr>
+          <w:rFonts w:ascii="Arial" w:hAnsi="Arial" w:cs="Arial"/>
+          <w:sz w:val="32"/>
+          <w:szCs w:val="32"/>
+          <w:lang w:val="en-US"/>
+        </w:rPr>
+        <w:t>Currently:</w:t>
+      </w:r>
+    </w:p>
+    <w:p>
+      <w:pPr>
+        <w:pStyle w:val="a3"/>
+        <w:spacing w:after="0"/>
+        <w:textAlignment w:val="baseline"/>
+        <w:rPr>
+          <w:rFonts w:ascii="Arial" w:hAnsi="Arial" w:cs="Arial"/>
+          <w:sz w:val="32"/>
+          <w:szCs w:val="32"/>
+          <w:lang w:val="en-US"/>
+        </w:rPr>
+      </w:pPr>
+      <w:r>
+        <w:rPr>
+          <w:rFonts w:ascii="Arial" w:hAnsi="Arial" w:cs="Arial"/>
+          <w:sz w:val="32"/>
+          <w:szCs w:val="32"/>
+          <w:lang w:val="en-US"/>
+        </w:rPr>
+        <w:t xml:space="preserve">530 solved problems, rank 3 </w:t>
+      </w:r>
+      <w:proofErr w:type="spellStart"/>
+      <w:r>
+        <w:rPr>
+          <w:rFonts w:ascii="Arial" w:hAnsi="Arial" w:cs="Arial"/>
+          <w:sz w:val="32"/>
+          <w:szCs w:val="32"/>
+          <w:lang w:val="en-US"/>
+        </w:rPr>
+        <w:t>kyu</w:t>
+      </w:r>
+      <w:proofErr w:type="spellEnd"/>
+      <w:r>
+        <w:rPr>
+          <w:rFonts w:ascii="Arial" w:hAnsi="Arial" w:cs="Arial"/>
+          <w:sz w:val="32"/>
+          <w:szCs w:val="32"/>
+          <w:lang w:val="en-US"/>
+        </w:rPr>
+        <w:t xml:space="preserve"> (top 0.8%). I work with React, </w:t>
+      </w:r>
+      <w:proofErr w:type="spellStart"/>
+      <w:r>
+        <w:rPr>
+          <w:rFonts w:ascii="Arial" w:hAnsi="Arial" w:cs="Arial"/>
+          <w:color w:val="000000"/>
+          <w:sz w:val="32"/>
+          <w:szCs w:val="32"/>
+          <w:shd w:val="clear" w:color="auto" w:fill="FFFFFF"/>
+          <w:lang w:val="en-US"/>
+        </w:rPr>
+        <w:t>Vite</w:t>
+      </w:r>
+      <w:proofErr w:type="spellEnd"/>
+      <w:r>
+        <w:rPr>
+          <w:rFonts w:ascii="Arial" w:hAnsi="Arial" w:cs="Arial"/>
+          <w:color w:val="000000"/>
+          <w:sz w:val="32"/>
+          <w:szCs w:val="32"/>
+          <w:shd w:val="clear" w:color="auto" w:fill="FFFFFF"/>
+          <w:lang w:val="en-US"/>
+        </w:rPr>
+        <w:t xml:space="preserve">, </w:t>
+      </w:r>
+      <w:r>
+        <w:rPr>
+          <w:rFonts w:ascii="Arial" w:hAnsi="Arial" w:cs="Arial"/>
+          <w:sz w:val="32"/>
+          <w:szCs w:val="32"/>
+          <w:lang w:val="en-US"/>
+        </w:rPr>
+        <w:t xml:space="preserve">JavaScript, </w:t>
+      </w:r>
+      <w:proofErr w:type="spellStart"/>
+      <w:r>
+        <w:rPr>
+          <w:rFonts w:ascii="Arial" w:hAnsi="Arial" w:cs="Arial"/>
+          <w:sz w:val="32"/>
+          <w:szCs w:val="32"/>
+          <w:lang w:val="en-US"/>
+        </w:rPr>
+        <w:t>TypeScript</w:t>
+      </w:r>
+      <w:proofErr w:type="spellEnd"/>
+      <w:r>
+        <w:rPr>
+          <w:rFonts w:ascii="Arial" w:hAnsi="Arial" w:cs="Arial"/>
+          <w:sz w:val="32"/>
+          <w:szCs w:val="32"/>
+          <w:lang w:val="en-US"/>
+        </w:rPr>
+        <w:t xml:space="preserve">, </w:t>
+      </w:r>
+      <w:proofErr w:type="spellStart"/>
+      <w:r>
+        <w:rPr>
+          <w:rFonts w:ascii="Arial" w:hAnsi="Arial" w:cs="Arial"/>
+          <w:sz w:val="32"/>
+          <w:szCs w:val="32"/>
+          <w:lang w:val="en-US"/>
+        </w:rPr>
+        <w:t>Zustand</w:t>
+      </w:r>
+      <w:proofErr w:type="spellEnd"/>
+      <w:r>
+        <w:rPr>
+          <w:rFonts w:ascii="Arial" w:hAnsi="Arial" w:cs="Arial"/>
+          <w:sz w:val="32"/>
+          <w:szCs w:val="32"/>
+          <w:lang w:val="en-US"/>
+        </w:rPr>
+        <w:t xml:space="preserve">, </w:t>
+      </w:r>
+      <w:proofErr w:type="spellStart"/>
+      <w:r>
+        <w:rPr>
+          <w:rFonts w:ascii="Arial" w:hAnsi="Arial" w:cs="Arial"/>
+          <w:sz w:val="32"/>
+          <w:szCs w:val="32"/>
+          <w:lang w:val="en-US"/>
+        </w:rPr>
+        <w:t>Redux</w:t>
+      </w:r>
+      <w:proofErr w:type="spellEnd"/>
+      <w:r>
+        <w:rPr>
+          <w:rFonts w:ascii="Arial" w:hAnsi="Arial" w:cs="Arial"/>
+          <w:sz w:val="32"/>
+          <w:szCs w:val="32"/>
+          <w:lang w:val="en-US"/>
+        </w:rPr>
+        <w:t xml:space="preserve"> Toolkit, SCSS. I handle layout and JavaScript independently. Interested in vibe coding and working with neural networks.</w:t>
+      </w:r>
+    </w:p>
+    <w:p>
+      <w:pPr>
+        <w:pStyle w:val="a3"/>
+        <w:spacing w:after="0"/>
+        <w:textAlignment w:val="baseline"/>
+        <w:rPr>
+          <w:rFonts w:ascii="Arial" w:hAnsi="Arial" w:cs="Arial"/>
+          <w:sz w:val="32"/>
+          <w:szCs w:val="32"/>
+          <w:lang w:val="en-US"/>
+        </w:rPr>
+      </w:pPr>
+    </w:p>
+    <w:p>
+      <w:pPr>
+        <w:pStyle w:val="a3"/>
+        <w:spacing w:after="0"/>
+        <w:textAlignment w:val="baseline"/>
+        <w:rPr>
+          <w:rFonts w:ascii="Arial" w:hAnsi="Arial" w:cs="Arial"/>
+          <w:sz w:val="32"/>
+          <w:szCs w:val="32"/>
+          <w:lang w:val="en-US"/>
+        </w:rPr>
+      </w:pPr>
+      <w:r>
+        <w:rPr>
+          <w:rFonts w:ascii="Arial" w:hAnsi="Arial" w:cs="Arial"/>
+          <w:sz w:val="32"/>
+          <w:szCs w:val="32"/>
+          <w:lang w:val="en-US"/>
+        </w:rPr>
+        <w:t>Tech Stack:</w:t>
+      </w:r>
+    </w:p>
+    <w:p>
+      <w:pPr>
+        <w:pStyle w:val="a3"/>
+        <w:spacing w:before="0" w:beforeAutospacing="0" w:after="0" w:afterAutospacing="0"/>
+        <w:textAlignment w:val="baseline"/>
+        <w:rPr>
+          <w:rFonts w:ascii="Arial" w:hAnsi="Arial" w:cs="Arial"/>
+          <w:sz w:val="32"/>
+          <w:szCs w:val="32"/>
+          <w:lang w:val="en-US"/>
+        </w:rPr>
+      </w:pPr>
+      <w:r>
+        <w:rPr>
+          <w:rFonts w:ascii="Arial" w:hAnsi="Arial" w:cs="Arial"/>
+          <w:sz w:val="32"/>
+          <w:szCs w:val="32"/>
+          <w:lang w:val="en-US"/>
+        </w:rPr>
+        <w:t xml:space="preserve">React </w:t>
+      </w:r>
+      <w:r>
+        <w:rPr>
+          <w:rFonts w:ascii="Arial" w:hAnsi="Arial" w:cs="Arial"/>
+          <w:color w:val="000000"/>
+          <w:sz w:val="32"/>
+          <w:szCs w:val="32"/>
+          <w:shd w:val="clear" w:color="auto" w:fill="FFFFFF"/>
+          <w:lang w:val="en-US"/>
+        </w:rPr>
+        <w:t xml:space="preserve">• </w:t>
+      </w:r>
+      <w:proofErr w:type="spellStart"/>
+      <w:r>
+        <w:rPr>
+          <w:rFonts w:ascii="Arial" w:hAnsi="Arial" w:cs="Arial"/>
+          <w:color w:val="000000"/>
+          <w:sz w:val="32"/>
+          <w:szCs w:val="32"/>
+          <w:shd w:val="clear" w:color="auto" w:fill="FFFFFF"/>
+          <w:lang w:val="en-US"/>
+        </w:rPr>
+        <w:t>Vite</w:t>
+      </w:r>
+      <w:proofErr w:type="spellEnd"/>
+      <w:r>
+        <w:rPr>
+          <w:rFonts w:ascii="Arial" w:hAnsi="Arial" w:cs="Arial"/>
+          <w:color w:val="000000"/>
+          <w:sz w:val="32"/>
+          <w:szCs w:val="32"/>
+          <w:shd w:val="clear" w:color="auto" w:fill="FFFFFF"/>
+          <w:lang w:val="en-US"/>
+        </w:rPr>
+        <w:t xml:space="preserve"> </w:t>
+      </w:r>
+      <w:r>
+        <w:rPr>
+          <w:rFonts w:ascii="Arial" w:hAnsi="Arial" w:cs="Arial"/>
+          <w:sz w:val="32"/>
+          <w:szCs w:val="32"/>
+          <w:lang w:val="en-US"/>
+        </w:rPr>
+        <w:t xml:space="preserve">• JavaScript • </w:t>
+      </w:r>
+      <w:proofErr w:type="spellStart"/>
+      <w:r>
+        <w:rPr>
+          <w:rFonts w:ascii="Arial" w:hAnsi="Arial" w:cs="Arial"/>
+          <w:sz w:val="32"/>
+          <w:szCs w:val="32"/>
+          <w:lang w:val="en-US"/>
+        </w:rPr>
+        <w:t>TypeScript</w:t>
+      </w:r>
+      <w:proofErr w:type="spellEnd"/>
+      <w:r>
+        <w:rPr>
+          <w:rFonts w:ascii="Arial" w:hAnsi="Arial" w:cs="Arial"/>
+          <w:sz w:val="32"/>
+          <w:szCs w:val="32"/>
+          <w:lang w:val="en-US"/>
+        </w:rPr>
+        <w:t xml:space="preserve"> • </w:t>
+      </w:r>
+      <w:proofErr w:type="spellStart"/>
+      <w:r>
+        <w:rPr>
+          <w:rFonts w:ascii="Arial" w:hAnsi="Arial" w:cs="Arial"/>
+          <w:color w:val="000000"/>
+          <w:sz w:val="32"/>
+          <w:szCs w:val="32"/>
+          <w:shd w:val="clear" w:color="auto" w:fill="FFFFFF"/>
+          <w:lang w:val="en-US"/>
+        </w:rPr>
+        <w:t>Zod</w:t>
+      </w:r>
+      <w:proofErr w:type="spellEnd"/>
+      <w:r>
+        <w:rPr>
+          <w:rFonts w:ascii="Arial" w:hAnsi="Arial" w:cs="Arial"/>
+          <w:color w:val="000000"/>
+          <w:sz w:val="32"/>
+          <w:szCs w:val="32"/>
+          <w:shd w:val="clear" w:color="auto" w:fill="FFFFFF"/>
+          <w:lang w:val="en-US"/>
+        </w:rPr>
+        <w:t xml:space="preserve"> </w:t>
+      </w:r>
+      <w:r>
+        <w:rPr>
+          <w:rFonts w:ascii="Arial" w:hAnsi="Arial" w:cs="Arial"/>
+          <w:color w:val="000000"/>
+          <w:sz w:val="32"/>
+          <w:szCs w:val="32"/>
+          <w:shd w:val="clear" w:color="auto" w:fill="FFFFFF"/>
+          <w:lang w:val="en-US"/>
+        </w:rPr>
+        <w:t>•</w:t>
+      </w:r>
+      <w:r>
+        <w:rPr>
+          <w:rFonts w:ascii="Arial" w:hAnsi="Arial" w:cs="Arial"/>
+          <w:color w:val="000000"/>
+          <w:sz w:val="32"/>
+          <w:szCs w:val="32"/>
+          <w:shd w:val="clear" w:color="auto" w:fill="FFFFFF"/>
+          <w:lang w:val="en-US"/>
+        </w:rPr>
+        <w:t xml:space="preserve"> </w:t>
+      </w:r>
+      <w:proofErr w:type="spellStart"/>
+      <w:r>
+        <w:rPr>
+          <w:rFonts w:ascii="Arial" w:hAnsi="Arial" w:cs="Arial"/>
+          <w:color w:val="000000"/>
+          <w:sz w:val="32"/>
+          <w:szCs w:val="32"/>
+          <w:shd w:val="clear" w:color="auto" w:fill="FFFFFF"/>
+          <w:lang w:val="en-US"/>
+        </w:rPr>
+        <w:t>TanStack</w:t>
+      </w:r>
+      <w:proofErr w:type="spellEnd"/>
+      <w:r>
+        <w:rPr>
+          <w:rFonts w:ascii="Arial" w:hAnsi="Arial" w:cs="Arial"/>
+          <w:color w:val="000000"/>
+          <w:sz w:val="32"/>
+          <w:szCs w:val="32"/>
+          <w:shd w:val="clear" w:color="auto" w:fill="FFFFFF"/>
+          <w:lang w:val="en-US"/>
+        </w:rPr>
+        <w:t xml:space="preserve"> Router</w:t>
+      </w:r>
+      <w:r>
+        <w:rPr>
+          <w:rFonts w:ascii="Arial" w:hAnsi="Arial" w:cs="Arial"/>
+          <w:color w:val="000000"/>
+          <w:sz w:val="32"/>
+          <w:szCs w:val="32"/>
+          <w:shd w:val="clear" w:color="auto" w:fill="FFFFFF"/>
+          <w:lang w:val="en-US"/>
+        </w:rPr>
+        <w:t xml:space="preserve"> </w:t>
+      </w:r>
+      <w:r>
+        <w:rPr>
+          <w:rFonts w:ascii="Arial" w:hAnsi="Arial" w:cs="Arial"/>
+          <w:color w:val="000000"/>
+          <w:sz w:val="32"/>
+          <w:szCs w:val="32"/>
+          <w:shd w:val="clear" w:color="auto" w:fill="FFFFFF"/>
+          <w:lang w:val="en-US"/>
+        </w:rPr>
+        <w:t>•</w:t>
+      </w:r>
+      <w:r>
+        <w:rPr>
+          <w:rFonts w:ascii="Arial" w:hAnsi="Arial" w:cs="Arial"/>
+          <w:color w:val="000000"/>
+          <w:sz w:val="32"/>
+          <w:szCs w:val="32"/>
+          <w:shd w:val="clear" w:color="auto" w:fill="FFFFFF"/>
+          <w:lang w:val="en-US"/>
+        </w:rPr>
+        <w:t xml:space="preserve"> </w:t>
+      </w:r>
+      <w:proofErr w:type="spellStart"/>
+      <w:r>
+        <w:rPr>
+          <w:rFonts w:ascii="Arial" w:hAnsi="Arial" w:cs="Arial"/>
+          <w:sz w:val="32"/>
+          <w:szCs w:val="32"/>
+          <w:lang w:val="en-US"/>
+        </w:rPr>
+        <w:t>Zustand</w:t>
+      </w:r>
+      <w:proofErr w:type="spellEnd"/>
+      <w:r>
+        <w:rPr>
+          <w:rFonts w:ascii="Arial" w:hAnsi="Arial" w:cs="Arial"/>
+          <w:sz w:val="32"/>
+          <w:szCs w:val="32"/>
+          <w:lang w:val="en-US"/>
+        </w:rPr>
+        <w:t xml:space="preserve"> • </w:t>
+      </w:r>
+      <w:proofErr w:type="spellStart"/>
+      <w:r>
+        <w:rPr>
+          <w:rFonts w:ascii="Arial" w:hAnsi="Arial" w:cs="Arial"/>
+          <w:color w:val="000000"/>
+          <w:sz w:val="32"/>
+          <w:szCs w:val="32"/>
+          <w:shd w:val="clear" w:color="auto" w:fill="FFFFFF"/>
+          <w:lang w:val="en-US"/>
+        </w:rPr>
+        <w:t>Axios</w:t>
+      </w:r>
+      <w:proofErr w:type="spellEnd"/>
+      <w:r>
+        <w:rPr>
+          <w:rFonts w:ascii="Arial" w:hAnsi="Arial" w:cs="Arial"/>
+          <w:color w:val="000000"/>
+          <w:sz w:val="32"/>
+          <w:szCs w:val="32"/>
+          <w:shd w:val="clear" w:color="auto" w:fill="FFFFFF"/>
+          <w:lang w:val="en-US"/>
+        </w:rPr>
+        <w:t xml:space="preserve"> </w:t>
+      </w:r>
+      <w:r>
+        <w:rPr>
+          <w:rFonts w:ascii="Arial" w:hAnsi="Arial" w:cs="Arial"/>
+          <w:color w:val="000000"/>
+          <w:sz w:val="32"/>
+          <w:szCs w:val="32"/>
+          <w:shd w:val="clear" w:color="auto" w:fill="FFFFFF"/>
+          <w:lang w:val="en-US"/>
+        </w:rPr>
+        <w:t>•</w:t>
+      </w:r>
+      <w:r>
+        <w:rPr>
+          <w:rFonts w:ascii="Arial" w:hAnsi="Arial" w:cs="Arial"/>
+          <w:color w:val="000000"/>
+          <w:sz w:val="32"/>
+          <w:szCs w:val="32"/>
+          <w:shd w:val="clear" w:color="auto" w:fill="FFFFFF"/>
+          <w:lang w:val="en-US"/>
+        </w:rPr>
+        <w:t xml:space="preserve"> </w:t>
+      </w:r>
+      <w:proofErr w:type="spellStart"/>
+      <w:r>
+        <w:rPr>
+          <w:rFonts w:ascii="Arial" w:hAnsi="Arial" w:cs="Arial"/>
+          <w:sz w:val="32"/>
+          <w:szCs w:val="32"/>
+          <w:lang w:val="en-US"/>
+        </w:rPr>
+        <w:t>Redux</w:t>
+      </w:r>
+      <w:proofErr w:type="spellEnd"/>
+      <w:r>
+        <w:rPr>
+          <w:rFonts w:ascii="Arial" w:hAnsi="Arial" w:cs="Arial"/>
+          <w:sz w:val="32"/>
+          <w:szCs w:val="32"/>
+          <w:lang w:val="en-US"/>
+        </w:rPr>
+        <w:t xml:space="preserve"> Toolkit • SCSS</w:t>
+      </w:r>
       <w:bookmarkStart w:id="0" w:name="_GoBack"/>
       <w:bookmarkEnd w:id="0"/>
-    </w:p>
-    <w:p>
-      <w:pPr>
-        <w:pStyle w:val="a3"/>
-        <w:spacing w:after="0"/>
-        <w:textAlignment w:val="baseline"/>
-        <w:rPr>
-          <w:rFonts w:ascii="Arial" w:hAnsi="Arial" w:cs="Arial"/>
-          <w:sz w:val="32"/>
-          <w:szCs w:val="32"/>
-          <w:lang w:val="en-US"/>
-        </w:rPr>
-      </w:pPr>
-    </w:p>
-    <w:p>
-      <w:pPr>
-        <w:pStyle w:val="a3"/>
-        <w:spacing w:after="0"/>
-        <w:textAlignment w:val="baseline"/>
-        <w:rPr>
-          <w:rFonts w:ascii="Arial" w:hAnsi="Arial" w:cs="Arial"/>
-          <w:sz w:val="32"/>
-          <w:szCs w:val="32"/>
-          <w:lang w:val="en-US"/>
-        </w:rPr>
-      </w:pPr>
-    </w:p>
-    <w:p>
-      <w:pPr>
-        <w:pStyle w:val="a3"/>
-        <w:spacing w:after="0"/>
-        <w:textAlignment w:val="baseline"/>
-        <w:rPr>
-          <w:rFonts w:ascii="Arial" w:hAnsi="Arial" w:cs="Arial"/>
-          <w:sz w:val="32"/>
-          <w:szCs w:val="32"/>
-          <w:lang w:val="en-US"/>
-        </w:rPr>
-      </w:pPr>
-      <w:r>
-        <w:rPr>
-          <w:rFonts w:ascii="Arial" w:hAnsi="Arial" w:cs="Arial"/>
-          <w:sz w:val="32"/>
-          <w:szCs w:val="32"/>
-          <w:lang w:val="en-US"/>
-        </w:rPr>
-        <w:lastRenderedPageBreak/>
-        <w:t>About Me (English Version)</w:t>
-      </w:r>
-    </w:p>
-    <w:p>
-      <w:pPr>
-        <w:pStyle w:val="a3"/>
-        <w:spacing w:after="0"/>
-        <w:textAlignment w:val="baseline"/>
-        <w:rPr>
-          <w:rFonts w:ascii="Arial" w:hAnsi="Arial" w:cs="Arial"/>
-          <w:sz w:val="32"/>
-          <w:szCs w:val="32"/>
-          <w:lang w:val="en-US"/>
-        </w:rPr>
-      </w:pPr>
-      <w:r>
-        <w:rPr>
-          <w:rFonts w:ascii="Arial" w:hAnsi="Arial" w:cs="Arial"/>
-          <w:sz w:val="32"/>
-          <w:szCs w:val="32"/>
-          <w:lang w:val="en-US"/>
-        </w:rPr>
-        <w:t>Before Web Development:</w:t>
-      </w:r>
-    </w:p>
-    <w:p>
-      <w:pPr>
-        <w:pStyle w:val="a3"/>
-        <w:textAlignment w:val="baseline"/>
-        <w:rPr>
-          <w:rFonts w:ascii="Arial" w:hAnsi="Arial" w:cs="Arial"/>
-          <w:sz w:val="32"/>
-          <w:szCs w:val="32"/>
-          <w:lang w:val="en-US"/>
-        </w:rPr>
-      </w:pPr>
-      <w:r>
-        <w:rPr>
-          <w:rFonts w:ascii="Arial" w:hAnsi="Arial" w:cs="Arial"/>
-          <w:sz w:val="32"/>
-          <w:szCs w:val="32"/>
-          <w:lang w:val="en-US"/>
-        </w:rPr>
-        <w:t>Graduated from the Lvov Cultural College. Worked as a guitar teacher at a Children's Art School. Later moved to the House of Culture as a sound engineer — handled sound for events and started editing videos on the side.</w:t>
-      </w:r>
-    </w:p>
-    <w:p>
-      <w:pPr>
-        <w:pStyle w:val="a3"/>
-        <w:spacing w:after="0"/>
-        <w:textAlignment w:val="baseline"/>
-        <w:rPr>
-          <w:rFonts w:ascii="Arial" w:hAnsi="Arial" w:cs="Arial"/>
-          <w:sz w:val="32"/>
-          <w:szCs w:val="32"/>
-          <w:lang w:val="en-US"/>
-        </w:rPr>
-      </w:pPr>
-    </w:p>
-    <w:p>
-      <w:pPr>
-        <w:pStyle w:val="a3"/>
-        <w:spacing w:after="0"/>
-        <w:textAlignment w:val="baseline"/>
-        <w:rPr>
-          <w:rFonts w:ascii="Arial" w:hAnsi="Arial" w:cs="Arial"/>
-          <w:sz w:val="32"/>
-          <w:szCs w:val="32"/>
-          <w:lang w:val="en-US"/>
-        </w:rPr>
-      </w:pPr>
-      <w:r>
-        <w:rPr>
-          <w:rFonts w:ascii="Arial" w:hAnsi="Arial" w:cs="Arial"/>
-          <w:sz w:val="32"/>
-          <w:szCs w:val="32"/>
-          <w:lang w:val="en-US"/>
-        </w:rPr>
-        <w:t>During this period, I also began composing music for stock audio platforms (AudioJingle), working as a composer. My music was used on YouTube, television, and other media outlets. Competition turned out to be too high, so music composition remained a hobby.</w:t>
-      </w:r>
-    </w:p>
-    <w:p>
-      <w:pPr>
-        <w:pStyle w:val="a3"/>
-        <w:spacing w:after="0"/>
-        <w:textAlignment w:val="baseline"/>
-        <w:rPr>
-          <w:rFonts w:ascii="Arial" w:hAnsi="Arial" w:cs="Arial"/>
-          <w:sz w:val="32"/>
-          <w:szCs w:val="32"/>
-          <w:lang w:val="en-US"/>
-        </w:rPr>
-      </w:pPr>
-    </w:p>
-    <w:p>
-      <w:pPr>
-        <w:pStyle w:val="a3"/>
-        <w:spacing w:after="0"/>
-        <w:textAlignment w:val="baseline"/>
-        <w:rPr>
-          <w:rFonts w:ascii="Arial" w:hAnsi="Arial" w:cs="Arial"/>
-          <w:sz w:val="32"/>
-          <w:szCs w:val="32"/>
-          <w:lang w:val="en-US"/>
-        </w:rPr>
-      </w:pPr>
-      <w:r>
-        <w:rPr>
-          <w:rFonts w:ascii="Arial" w:hAnsi="Arial" w:cs="Arial"/>
-          <w:sz w:val="32"/>
-          <w:szCs w:val="32"/>
-          <w:lang w:val="en-US"/>
-        </w:rPr>
-        <w:t>After the House of Culture, I worked as a layout designer at a local newspaper — handled the layout for every issue. Later returned to the House of Culture as a video editor. Simultaneously took freelance projects from the local Administration: video projects, intros, promos. Registered as self-employed in two fields — video editing and composing.</w:t>
-      </w:r>
-    </w:p>
-    <w:p>
-      <w:pPr>
-        <w:pStyle w:val="a3"/>
-        <w:spacing w:after="0"/>
-        <w:textAlignment w:val="baseline"/>
-        <w:rPr>
-          <w:rFonts w:ascii="Arial" w:hAnsi="Arial" w:cs="Arial"/>
-          <w:sz w:val="32"/>
-          <w:szCs w:val="32"/>
-          <w:lang w:val="en-US"/>
-        </w:rPr>
-      </w:pPr>
-    </w:p>
-    <w:p>
-      <w:pPr>
-        <w:pStyle w:val="a3"/>
-        <w:spacing w:after="0"/>
-        <w:textAlignment w:val="baseline"/>
-        <w:rPr>
-          <w:rFonts w:ascii="Arial" w:hAnsi="Arial" w:cs="Arial"/>
-          <w:sz w:val="32"/>
-          <w:szCs w:val="32"/>
-          <w:lang w:val="en-US"/>
-        </w:rPr>
-      </w:pPr>
-      <w:r>
-        <w:rPr>
-          <w:rFonts w:ascii="Arial" w:hAnsi="Arial" w:cs="Arial"/>
-          <w:sz w:val="32"/>
-          <w:szCs w:val="32"/>
-          <w:lang w:val="en-US"/>
-        </w:rPr>
-        <w:t>Notable projects:</w:t>
-      </w:r>
-    </w:p>
-    <w:p>
-      <w:pPr>
-        <w:pStyle w:val="a3"/>
-        <w:spacing w:after="0"/>
-        <w:textAlignment w:val="baseline"/>
-        <w:rPr>
-          <w:rFonts w:ascii="Arial" w:hAnsi="Arial" w:cs="Arial"/>
-          <w:sz w:val="32"/>
-          <w:szCs w:val="32"/>
-          <w:lang w:val="en-US"/>
-        </w:rPr>
-      </w:pPr>
-    </w:p>
-    <w:p>
-      <w:pPr>
-        <w:pStyle w:val="a3"/>
-        <w:spacing w:after="0"/>
-        <w:textAlignment w:val="baseline"/>
-        <w:rPr>
-          <w:rFonts w:ascii="Arial" w:hAnsi="Arial" w:cs="Arial"/>
-          <w:sz w:val="32"/>
-          <w:szCs w:val="32"/>
-          <w:lang w:val="en-US"/>
-        </w:rPr>
-      </w:pPr>
-      <w:r>
-        <w:rPr>
-          <w:rFonts w:ascii="Arial" w:hAnsi="Arial" w:cs="Arial"/>
-          <w:sz w:val="32"/>
-          <w:szCs w:val="32"/>
-          <w:lang w:val="en-US"/>
-        </w:rPr>
-        <w:t>Full video production for the Karelian culture festival "</w:t>
-      </w:r>
-      <w:proofErr w:type="spellStart"/>
-      <w:r>
-        <w:rPr>
-          <w:rFonts w:ascii="Arial" w:hAnsi="Arial" w:cs="Arial"/>
-          <w:sz w:val="32"/>
-          <w:szCs w:val="32"/>
-          <w:lang w:val="en-US"/>
-        </w:rPr>
-        <w:t>Oma</w:t>
-      </w:r>
-      <w:proofErr w:type="spellEnd"/>
-      <w:r>
-        <w:rPr>
-          <w:rFonts w:ascii="Arial" w:hAnsi="Arial" w:cs="Arial"/>
-          <w:sz w:val="32"/>
-          <w:szCs w:val="32"/>
-          <w:lang w:val="en-US"/>
-        </w:rPr>
-        <w:t xml:space="preserve"> </w:t>
-      </w:r>
-      <w:proofErr w:type="spellStart"/>
-      <w:r>
-        <w:rPr>
-          <w:rFonts w:ascii="Arial" w:hAnsi="Arial" w:cs="Arial"/>
-          <w:sz w:val="32"/>
-          <w:szCs w:val="32"/>
-          <w:lang w:val="en-US"/>
-        </w:rPr>
-        <w:t>Randa</w:t>
-      </w:r>
-      <w:proofErr w:type="spellEnd"/>
-      <w:r>
-        <w:rPr>
-          <w:rFonts w:ascii="Arial" w:hAnsi="Arial" w:cs="Arial"/>
-          <w:sz w:val="32"/>
-          <w:szCs w:val="32"/>
-          <w:lang w:val="en-US"/>
-        </w:rPr>
-        <w:t>" (editing videos with 3D integration in Cinema 4D, arranging the anthem)</w:t>
-      </w:r>
-    </w:p>
-    <w:p>
-      <w:pPr>
-        <w:pStyle w:val="a3"/>
-        <w:spacing w:after="0"/>
-        <w:textAlignment w:val="baseline"/>
-        <w:rPr>
-          <w:rFonts w:ascii="Arial" w:hAnsi="Arial" w:cs="Arial"/>
-          <w:sz w:val="32"/>
-          <w:szCs w:val="32"/>
-          <w:lang w:val="en-US"/>
-        </w:rPr>
-      </w:pPr>
-    </w:p>
-    <w:p>
-      <w:pPr>
-        <w:pStyle w:val="a3"/>
-        <w:spacing w:after="0"/>
-        <w:textAlignment w:val="baseline"/>
-        <w:rPr>
-          <w:rFonts w:ascii="Arial" w:hAnsi="Arial" w:cs="Arial"/>
-          <w:sz w:val="32"/>
-          <w:szCs w:val="32"/>
-          <w:lang w:val="en-US"/>
-        </w:rPr>
-      </w:pPr>
-      <w:r>
-        <w:rPr>
-          <w:rFonts w:ascii="Arial" w:hAnsi="Arial" w:cs="Arial"/>
-          <w:sz w:val="32"/>
-          <w:szCs w:val="32"/>
-          <w:lang w:val="en-US"/>
-        </w:rPr>
-        <w:t>Created an animated 3D intro for the children's show "</w:t>
-      </w:r>
-      <w:proofErr w:type="spellStart"/>
-      <w:r>
-        <w:rPr>
-          <w:rFonts w:ascii="Arial" w:hAnsi="Arial" w:cs="Arial"/>
-          <w:sz w:val="32"/>
-          <w:szCs w:val="32"/>
-          <w:lang w:val="en-US"/>
-        </w:rPr>
-        <w:t>Vse</w:t>
-      </w:r>
-      <w:proofErr w:type="spellEnd"/>
-      <w:r>
-        <w:rPr>
-          <w:rFonts w:ascii="Arial" w:hAnsi="Arial" w:cs="Arial"/>
-          <w:sz w:val="32"/>
-          <w:szCs w:val="32"/>
-          <w:lang w:val="en-US"/>
-        </w:rPr>
-        <w:t xml:space="preserve"> obo </w:t>
-      </w:r>
-      <w:proofErr w:type="spellStart"/>
-      <w:r>
-        <w:rPr>
-          <w:rFonts w:ascii="Arial" w:hAnsi="Arial" w:cs="Arial"/>
-          <w:sz w:val="32"/>
-          <w:szCs w:val="32"/>
-          <w:lang w:val="en-US"/>
-        </w:rPr>
-        <w:t>vsem</w:t>
-      </w:r>
-      <w:proofErr w:type="spellEnd"/>
-      <w:r>
-        <w:rPr>
-          <w:rFonts w:ascii="Arial" w:hAnsi="Arial" w:cs="Arial"/>
-          <w:sz w:val="32"/>
-          <w:szCs w:val="32"/>
-          <w:lang w:val="en-US"/>
-        </w:rPr>
-        <w:t>"</w:t>
-      </w:r>
-    </w:p>
-    <w:p>
-      <w:pPr>
-        <w:pStyle w:val="a3"/>
-        <w:spacing w:after="0"/>
-        <w:textAlignment w:val="baseline"/>
-        <w:rPr>
-          <w:rFonts w:ascii="Arial" w:hAnsi="Arial" w:cs="Arial"/>
-          <w:sz w:val="32"/>
-          <w:szCs w:val="32"/>
-          <w:lang w:val="en-US"/>
-        </w:rPr>
-      </w:pPr>
-    </w:p>
-    <w:p>
-      <w:pPr>
-        <w:pStyle w:val="a3"/>
-        <w:spacing w:after="0"/>
-        <w:textAlignment w:val="baseline"/>
-        <w:rPr>
-          <w:rFonts w:ascii="Arial" w:hAnsi="Arial" w:cs="Arial"/>
-          <w:sz w:val="32"/>
-          <w:szCs w:val="32"/>
-          <w:lang w:val="en-US"/>
-        </w:rPr>
-      </w:pPr>
-      <w:r>
-        <w:rPr>
-          <w:rFonts w:ascii="Arial" w:hAnsi="Arial" w:cs="Arial"/>
-          <w:sz w:val="32"/>
-          <w:szCs w:val="32"/>
-          <w:lang w:val="en-US"/>
-        </w:rPr>
-        <w:t>Path into IT:</w:t>
-      </w:r>
-    </w:p>
-    <w:p>
-      <w:pPr>
-        <w:pStyle w:val="a3"/>
-        <w:spacing w:after="0"/>
-        <w:textAlignment w:val="baseline"/>
-        <w:rPr>
-          <w:rFonts w:ascii="Arial" w:hAnsi="Arial" w:cs="Arial"/>
-          <w:sz w:val="32"/>
-          <w:szCs w:val="32"/>
-          <w:lang w:val="en-US"/>
-        </w:rPr>
-      </w:pPr>
-      <w:r>
-        <w:rPr>
-          <w:rFonts w:ascii="Arial" w:hAnsi="Arial" w:cs="Arial"/>
-          <w:sz w:val="32"/>
-          <w:szCs w:val="32"/>
-          <w:lang w:val="en-US"/>
-        </w:rPr>
-        <w:t>Started with HTML and CSS on Code Basics. Took a one-year break due to workload at my main job. Returned to JavaScript on the same platform, then continued self-study: YouTube, online courses, coding along with instructors.</w:t>
-      </w:r>
-    </w:p>
-    <w:p>
-      <w:pPr>
-        <w:pStyle w:val="a3"/>
-        <w:spacing w:after="0"/>
-        <w:textAlignment w:val="baseline"/>
-        <w:rPr>
-          <w:rFonts w:ascii="Arial" w:hAnsi="Arial" w:cs="Arial"/>
-          <w:sz w:val="32"/>
-          <w:szCs w:val="32"/>
-          <w:lang w:val="en-US"/>
-        </w:rPr>
-      </w:pPr>
-    </w:p>
-    <w:p>
-      <w:pPr>
-        <w:pStyle w:val="a3"/>
-        <w:spacing w:after="0"/>
-        <w:textAlignment w:val="baseline"/>
-        <w:rPr>
-          <w:rFonts w:ascii="Arial" w:hAnsi="Arial" w:cs="Arial"/>
-          <w:sz w:val="32"/>
-          <w:szCs w:val="32"/>
-          <w:lang w:val="en-US"/>
-        </w:rPr>
-      </w:pPr>
-      <w:r>
-        <w:rPr>
-          <w:rFonts w:ascii="Arial" w:hAnsi="Arial" w:cs="Arial"/>
-          <w:sz w:val="32"/>
-          <w:szCs w:val="32"/>
-          <w:lang w:val="en-US"/>
-        </w:rPr>
-        <w:t xml:space="preserve">Tried Rolling Scopes School — my skills weren't sufficient at the time, so I focused on practice. Gradually worked my way up to React, </w:t>
-      </w:r>
-      <w:proofErr w:type="spellStart"/>
-      <w:r>
-        <w:rPr>
-          <w:rFonts w:ascii="Arial" w:hAnsi="Arial" w:cs="Arial"/>
-          <w:sz w:val="32"/>
-          <w:szCs w:val="32"/>
-          <w:lang w:val="en-US"/>
-        </w:rPr>
-        <w:t>TypeScript</w:t>
-      </w:r>
-      <w:proofErr w:type="spellEnd"/>
-      <w:r>
-        <w:rPr>
-          <w:rFonts w:ascii="Arial" w:hAnsi="Arial" w:cs="Arial"/>
-          <w:sz w:val="32"/>
-          <w:szCs w:val="32"/>
-          <w:lang w:val="en-US"/>
-        </w:rPr>
-        <w:t xml:space="preserve">, </w:t>
-      </w:r>
-      <w:proofErr w:type="spellStart"/>
-      <w:r>
-        <w:rPr>
-          <w:rFonts w:ascii="Arial" w:hAnsi="Arial" w:cs="Arial"/>
-          <w:sz w:val="32"/>
-          <w:szCs w:val="32"/>
-          <w:lang w:val="en-US"/>
-        </w:rPr>
-        <w:t>Zustand</w:t>
-      </w:r>
-      <w:proofErr w:type="spellEnd"/>
-      <w:r>
-        <w:rPr>
-          <w:rFonts w:ascii="Arial" w:hAnsi="Arial" w:cs="Arial"/>
-          <w:sz w:val="32"/>
-          <w:szCs w:val="32"/>
-          <w:lang w:val="en-US"/>
-        </w:rPr>
-        <w:t xml:space="preserve">, </w:t>
-      </w:r>
-      <w:proofErr w:type="spellStart"/>
-      <w:r>
-        <w:rPr>
-          <w:rFonts w:ascii="Arial" w:hAnsi="Arial" w:cs="Arial"/>
-          <w:sz w:val="32"/>
-          <w:szCs w:val="32"/>
-          <w:lang w:val="en-US"/>
-        </w:rPr>
-        <w:t>Redux</w:t>
-      </w:r>
-      <w:proofErr w:type="spellEnd"/>
-      <w:r>
-        <w:rPr>
-          <w:rFonts w:ascii="Arial" w:hAnsi="Arial" w:cs="Arial"/>
-          <w:sz w:val="32"/>
-          <w:szCs w:val="32"/>
-          <w:lang w:val="en-US"/>
-        </w:rPr>
-        <w:t xml:space="preserve"> Toolkit. Simultaneously solved problems on </w:t>
-      </w:r>
-      <w:proofErr w:type="spellStart"/>
-      <w:r>
-        <w:rPr>
-          <w:rFonts w:ascii="Arial" w:hAnsi="Arial" w:cs="Arial"/>
-          <w:sz w:val="32"/>
-          <w:szCs w:val="32"/>
-          <w:lang w:val="en-US"/>
-        </w:rPr>
-        <w:t>Codewars</w:t>
-      </w:r>
-      <w:proofErr w:type="spellEnd"/>
-      <w:r>
-        <w:rPr>
-          <w:rFonts w:ascii="Arial" w:hAnsi="Arial" w:cs="Arial"/>
-          <w:sz w:val="32"/>
-          <w:szCs w:val="32"/>
-          <w:lang w:val="en-US"/>
-        </w:rPr>
-        <w:t>.</w:t>
-      </w:r>
-    </w:p>
-    <w:p>
-      <w:pPr>
-        <w:pStyle w:val="a3"/>
-        <w:spacing w:after="0"/>
-        <w:textAlignment w:val="baseline"/>
-        <w:rPr>
-          <w:rFonts w:ascii="Arial" w:hAnsi="Arial" w:cs="Arial"/>
-          <w:sz w:val="32"/>
-          <w:szCs w:val="32"/>
-          <w:lang w:val="en-US"/>
-        </w:rPr>
-      </w:pPr>
-    </w:p>
-    <w:p>
-      <w:pPr>
-        <w:pStyle w:val="a3"/>
-        <w:spacing w:after="0"/>
-        <w:textAlignment w:val="baseline"/>
-        <w:rPr>
-          <w:rFonts w:ascii="Arial" w:hAnsi="Arial" w:cs="Arial"/>
-          <w:sz w:val="32"/>
-          <w:szCs w:val="32"/>
-          <w:lang w:val="en-US"/>
-        </w:rPr>
-      </w:pPr>
-      <w:r>
-        <w:rPr>
-          <w:rFonts w:ascii="Arial" w:hAnsi="Arial" w:cs="Arial"/>
-          <w:sz w:val="32"/>
-          <w:szCs w:val="32"/>
-          <w:lang w:val="en-US"/>
-        </w:rPr>
-        <w:t>Currently:</w:t>
-      </w:r>
-    </w:p>
-    <w:p>
-      <w:pPr>
-        <w:pStyle w:val="a3"/>
-        <w:spacing w:after="0"/>
-        <w:textAlignment w:val="baseline"/>
-        <w:rPr>
-          <w:rFonts w:ascii="Arial" w:hAnsi="Arial" w:cs="Arial"/>
-          <w:sz w:val="32"/>
-          <w:szCs w:val="32"/>
-          <w:lang w:val="en-US"/>
-        </w:rPr>
-      </w:pPr>
-      <w:r>
-        <w:rPr>
-          <w:rFonts w:ascii="Arial" w:hAnsi="Arial" w:cs="Arial"/>
-          <w:sz w:val="32"/>
-          <w:szCs w:val="32"/>
-          <w:lang w:val="en-US"/>
-        </w:rPr>
-        <w:t xml:space="preserve">530 solved problems, rank 3 </w:t>
-      </w:r>
-      <w:proofErr w:type="spellStart"/>
-      <w:r>
-        <w:rPr>
-          <w:rFonts w:ascii="Arial" w:hAnsi="Arial" w:cs="Arial"/>
-          <w:sz w:val="32"/>
-          <w:szCs w:val="32"/>
-          <w:lang w:val="en-US"/>
-        </w:rPr>
-        <w:t>kyu</w:t>
-      </w:r>
-      <w:proofErr w:type="spellEnd"/>
-      <w:r>
-        <w:rPr>
-          <w:rFonts w:ascii="Arial" w:hAnsi="Arial" w:cs="Arial"/>
-          <w:sz w:val="32"/>
-          <w:szCs w:val="32"/>
-          <w:lang w:val="en-US"/>
-        </w:rPr>
-        <w:t xml:space="preserve"> (top 0.8%). I work with React, </w:t>
-      </w:r>
-      <w:proofErr w:type="spellStart"/>
-      <w:r>
-        <w:rPr>
-          <w:rFonts w:ascii="Arial" w:hAnsi="Arial" w:cs="Arial"/>
-          <w:color w:val="000000"/>
-          <w:sz w:val="32"/>
-          <w:szCs w:val="32"/>
-          <w:shd w:val="clear" w:color="auto" w:fill="FFFFFF"/>
-          <w:lang w:val="en-US"/>
-        </w:rPr>
-        <w:t>Vite</w:t>
-      </w:r>
-      <w:proofErr w:type="spellEnd"/>
-      <w:r>
-        <w:rPr>
-          <w:rFonts w:ascii="Arial" w:hAnsi="Arial" w:cs="Arial"/>
-          <w:color w:val="000000"/>
-          <w:sz w:val="32"/>
-          <w:szCs w:val="32"/>
-          <w:shd w:val="clear" w:color="auto" w:fill="FFFFFF"/>
-          <w:lang w:val="en-US"/>
-        </w:rPr>
-        <w:t xml:space="preserve">, </w:t>
-      </w:r>
-      <w:r>
-        <w:rPr>
-          <w:rFonts w:ascii="Arial" w:hAnsi="Arial" w:cs="Arial"/>
-          <w:sz w:val="32"/>
-          <w:szCs w:val="32"/>
-          <w:lang w:val="en-US"/>
-        </w:rPr>
-        <w:t xml:space="preserve">JavaScript, </w:t>
-      </w:r>
-      <w:proofErr w:type="spellStart"/>
-      <w:r>
-        <w:rPr>
-          <w:rFonts w:ascii="Arial" w:hAnsi="Arial" w:cs="Arial"/>
-          <w:sz w:val="32"/>
-          <w:szCs w:val="32"/>
-          <w:lang w:val="en-US"/>
-        </w:rPr>
-        <w:t>TypeScript</w:t>
-      </w:r>
-      <w:proofErr w:type="spellEnd"/>
-      <w:r>
-        <w:rPr>
-          <w:rFonts w:ascii="Arial" w:hAnsi="Arial" w:cs="Arial"/>
-          <w:sz w:val="32"/>
-          <w:szCs w:val="32"/>
-          <w:lang w:val="en-US"/>
-        </w:rPr>
-        <w:t xml:space="preserve">, </w:t>
-      </w:r>
-      <w:proofErr w:type="spellStart"/>
-      <w:r>
-        <w:rPr>
-          <w:rFonts w:ascii="Arial" w:hAnsi="Arial" w:cs="Arial"/>
-          <w:sz w:val="32"/>
-          <w:szCs w:val="32"/>
-          <w:lang w:val="en-US"/>
-        </w:rPr>
-        <w:t>Zustand</w:t>
-      </w:r>
-      <w:proofErr w:type="spellEnd"/>
-      <w:r>
-        <w:rPr>
-          <w:rFonts w:ascii="Arial" w:hAnsi="Arial" w:cs="Arial"/>
-          <w:sz w:val="32"/>
-          <w:szCs w:val="32"/>
-          <w:lang w:val="en-US"/>
-        </w:rPr>
-        <w:t xml:space="preserve">, </w:t>
-      </w:r>
-      <w:proofErr w:type="spellStart"/>
-      <w:r>
-        <w:rPr>
-          <w:rFonts w:ascii="Arial" w:hAnsi="Arial" w:cs="Arial"/>
-          <w:sz w:val="32"/>
-          <w:szCs w:val="32"/>
-          <w:lang w:val="en-US"/>
-        </w:rPr>
-        <w:t>Redux</w:t>
-      </w:r>
-      <w:proofErr w:type="spellEnd"/>
-      <w:r>
-        <w:rPr>
-          <w:rFonts w:ascii="Arial" w:hAnsi="Arial" w:cs="Arial"/>
-          <w:sz w:val="32"/>
-          <w:szCs w:val="32"/>
-          <w:lang w:val="en-US"/>
-        </w:rPr>
-        <w:t xml:space="preserve"> Toolkit, SCSS. I handle layout and JavaScript independently. Interested in vibe coding and working with neural networks.</w:t>
-      </w:r>
-    </w:p>
-    <w:p>
-      <w:pPr>
-        <w:pStyle w:val="a3"/>
-        <w:spacing w:after="0"/>
-        <w:textAlignment w:val="baseline"/>
-        <w:rPr>
-          <w:rFonts w:ascii="Arial" w:hAnsi="Arial" w:cs="Arial"/>
-          <w:sz w:val="32"/>
-          <w:szCs w:val="32"/>
-          <w:lang w:val="en-US"/>
-        </w:rPr>
-      </w:pPr>
-    </w:p>
-    <w:p>
-      <w:pPr>
-        <w:pStyle w:val="a3"/>
-        <w:spacing w:after="0"/>
-        <w:textAlignment w:val="baseline"/>
-        <w:rPr>
-          <w:rFonts w:ascii="Arial" w:hAnsi="Arial" w:cs="Arial"/>
-          <w:sz w:val="32"/>
-          <w:szCs w:val="32"/>
-          <w:lang w:val="en-US"/>
-        </w:rPr>
-      </w:pPr>
-      <w:r>
-        <w:rPr>
-          <w:rFonts w:ascii="Arial" w:hAnsi="Arial" w:cs="Arial"/>
-          <w:sz w:val="32"/>
-          <w:szCs w:val="32"/>
-          <w:lang w:val="en-US"/>
-        </w:rPr>
-        <w:t>Tech Stack:</w:t>
-      </w:r>
-    </w:p>
-    <w:p>
-      <w:pPr>
-        <w:pStyle w:val="a3"/>
-        <w:spacing w:before="0" w:beforeAutospacing="0" w:after="0" w:afterAutospacing="0"/>
-        <w:textAlignment w:val="baseline"/>
-        <w:rPr>
-          <w:rFonts w:ascii="Arial" w:hAnsi="Arial" w:cs="Arial"/>
-          <w:sz w:val="32"/>
-          <w:szCs w:val="32"/>
-          <w:lang w:val="en-US"/>
-        </w:rPr>
-      </w:pPr>
-      <w:r>
-        <w:rPr>
-          <w:rFonts w:ascii="Arial" w:hAnsi="Arial" w:cs="Arial"/>
-          <w:sz w:val="32"/>
-          <w:szCs w:val="32"/>
-          <w:lang w:val="en-US"/>
-        </w:rPr>
-        <w:t xml:space="preserve">React </w:t>
-      </w:r>
-      <w:r>
-        <w:rPr>
-          <w:rFonts w:ascii="Arial" w:hAnsi="Arial" w:cs="Arial"/>
-          <w:color w:val="000000"/>
-          <w:sz w:val="32"/>
-          <w:szCs w:val="32"/>
-          <w:shd w:val="clear" w:color="auto" w:fill="FFFFFF"/>
-          <w:lang w:val="en-US"/>
-        </w:rPr>
-        <w:t xml:space="preserve">• </w:t>
-      </w:r>
-      <w:proofErr w:type="spellStart"/>
-      <w:r>
-        <w:rPr>
-          <w:rFonts w:ascii="Arial" w:hAnsi="Arial" w:cs="Arial"/>
-          <w:color w:val="000000"/>
-          <w:sz w:val="32"/>
-          <w:szCs w:val="32"/>
-          <w:shd w:val="clear" w:color="auto" w:fill="FFFFFF"/>
-          <w:lang w:val="en-US"/>
-        </w:rPr>
-        <w:t>Vite</w:t>
-      </w:r>
-      <w:proofErr w:type="spellEnd"/>
-      <w:r>
-        <w:rPr>
-          <w:rFonts w:ascii="Arial" w:hAnsi="Arial" w:cs="Arial"/>
-          <w:color w:val="000000"/>
-          <w:sz w:val="32"/>
-          <w:szCs w:val="32"/>
-          <w:shd w:val="clear" w:color="auto" w:fill="FFFFFF"/>
-          <w:lang w:val="en-US"/>
-        </w:rPr>
-        <w:t xml:space="preserve"> </w:t>
-      </w:r>
-      <w:r>
-        <w:rPr>
-          <w:rFonts w:ascii="Arial" w:hAnsi="Arial" w:cs="Arial"/>
-          <w:sz w:val="32"/>
-          <w:szCs w:val="32"/>
-          <w:lang w:val="en-US"/>
-        </w:rPr>
-        <w:t xml:space="preserve">• JavaScript • </w:t>
-      </w:r>
-      <w:proofErr w:type="spellStart"/>
-      <w:r>
-        <w:rPr>
-          <w:rFonts w:ascii="Arial" w:hAnsi="Arial" w:cs="Arial"/>
-          <w:sz w:val="32"/>
-          <w:szCs w:val="32"/>
-          <w:lang w:val="en-US"/>
-        </w:rPr>
-        <w:t>TypeScript</w:t>
-      </w:r>
-      <w:proofErr w:type="spellEnd"/>
-      <w:r>
-        <w:rPr>
-          <w:rFonts w:ascii="Arial" w:hAnsi="Arial" w:cs="Arial"/>
-          <w:sz w:val="32"/>
-          <w:szCs w:val="32"/>
-          <w:lang w:val="en-US"/>
-        </w:rPr>
-        <w:t xml:space="preserve"> • </w:t>
-      </w:r>
-      <w:proofErr w:type="spellStart"/>
-      <w:r>
-        <w:rPr>
-          <w:rFonts w:ascii="Arial" w:hAnsi="Arial" w:cs="Arial"/>
-          <w:color w:val="000000"/>
-          <w:sz w:val="32"/>
-          <w:szCs w:val="32"/>
-          <w:shd w:val="clear" w:color="auto" w:fill="FFFFFF"/>
-          <w:lang w:val="en-US"/>
-        </w:rPr>
-        <w:t>Zod</w:t>
-      </w:r>
-      <w:proofErr w:type="spellEnd"/>
-      <w:r>
-        <w:rPr>
-          <w:rFonts w:ascii="Arial" w:hAnsi="Arial" w:cs="Arial"/>
-          <w:color w:val="000000"/>
-          <w:sz w:val="32"/>
-          <w:szCs w:val="32"/>
-          <w:shd w:val="clear" w:color="auto" w:fill="FFFFFF"/>
-          <w:lang w:val="en-US"/>
-        </w:rPr>
-        <w:t xml:space="preserve"> </w:t>
-      </w:r>
-      <w:r>
-        <w:rPr>
-          <w:rFonts w:ascii="Arial" w:hAnsi="Arial" w:cs="Arial"/>
-          <w:color w:val="000000"/>
-          <w:sz w:val="32"/>
-          <w:szCs w:val="32"/>
-          <w:shd w:val="clear" w:color="auto" w:fill="FFFFFF"/>
-          <w:lang w:val="en-US"/>
-        </w:rPr>
-        <w:t>•</w:t>
-      </w:r>
-      <w:r>
-        <w:rPr>
-          <w:rFonts w:ascii="Arial" w:hAnsi="Arial" w:cs="Arial"/>
-          <w:color w:val="000000"/>
-          <w:sz w:val="32"/>
-          <w:szCs w:val="32"/>
-          <w:shd w:val="clear" w:color="auto" w:fill="FFFFFF"/>
-          <w:lang w:val="en-US"/>
-        </w:rPr>
-        <w:t xml:space="preserve"> </w:t>
-      </w:r>
-      <w:proofErr w:type="spellStart"/>
-      <w:r>
-        <w:rPr>
-          <w:rFonts w:ascii="Arial" w:hAnsi="Arial" w:cs="Arial"/>
-          <w:color w:val="000000"/>
-          <w:sz w:val="32"/>
-          <w:szCs w:val="32"/>
-          <w:shd w:val="clear" w:color="auto" w:fill="FFFFFF"/>
-          <w:lang w:val="en-US"/>
-        </w:rPr>
-        <w:t>TanStack</w:t>
-      </w:r>
-      <w:proofErr w:type="spellEnd"/>
-      <w:r>
-        <w:rPr>
-          <w:rFonts w:ascii="Arial" w:hAnsi="Arial" w:cs="Arial"/>
-          <w:color w:val="000000"/>
-          <w:sz w:val="32"/>
-          <w:szCs w:val="32"/>
-          <w:shd w:val="clear" w:color="auto" w:fill="FFFFFF"/>
-          <w:lang w:val="en-US"/>
-        </w:rPr>
-        <w:t xml:space="preserve"> Router</w:t>
-      </w:r>
-      <w:r>
-        <w:rPr>
-          <w:rFonts w:ascii="Arial" w:hAnsi="Arial" w:cs="Arial"/>
-          <w:color w:val="000000"/>
-          <w:sz w:val="32"/>
-          <w:szCs w:val="32"/>
-          <w:shd w:val="clear" w:color="auto" w:fill="FFFFFF"/>
-          <w:lang w:val="en-US"/>
-        </w:rPr>
-        <w:t xml:space="preserve"> </w:t>
-      </w:r>
-      <w:r>
-        <w:rPr>
-          <w:rFonts w:ascii="Arial" w:hAnsi="Arial" w:cs="Arial"/>
-          <w:color w:val="000000"/>
-          <w:sz w:val="32"/>
-          <w:szCs w:val="32"/>
-          <w:shd w:val="clear" w:color="auto" w:fill="FFFFFF"/>
-          <w:lang w:val="en-US"/>
-        </w:rPr>
-        <w:t>•</w:t>
-      </w:r>
-      <w:r>
-        <w:rPr>
-          <w:rFonts w:ascii="Arial" w:hAnsi="Arial" w:cs="Arial"/>
-          <w:color w:val="000000"/>
-          <w:sz w:val="32"/>
-          <w:szCs w:val="32"/>
-          <w:shd w:val="clear" w:color="auto" w:fill="FFFFFF"/>
-          <w:lang w:val="en-US"/>
-        </w:rPr>
-        <w:t xml:space="preserve"> </w:t>
-      </w:r>
-      <w:proofErr w:type="spellStart"/>
-      <w:r>
-        <w:rPr>
-          <w:rFonts w:ascii="Arial" w:hAnsi="Arial" w:cs="Arial"/>
-          <w:sz w:val="32"/>
-          <w:szCs w:val="32"/>
-          <w:lang w:val="en-US"/>
-        </w:rPr>
-        <w:t>Zustand</w:t>
-      </w:r>
-      <w:proofErr w:type="spellEnd"/>
-      <w:r>
-        <w:rPr>
-          <w:rFonts w:ascii="Arial" w:hAnsi="Arial" w:cs="Arial"/>
-          <w:sz w:val="32"/>
-          <w:szCs w:val="32"/>
-          <w:lang w:val="en-US"/>
-        </w:rPr>
-        <w:t xml:space="preserve"> • </w:t>
-      </w:r>
-      <w:proofErr w:type="spellStart"/>
-      <w:r>
-        <w:rPr>
-          <w:rFonts w:ascii="Arial" w:hAnsi="Arial" w:cs="Arial"/>
-          <w:sz w:val="32"/>
-          <w:szCs w:val="32"/>
-          <w:lang w:val="en-US"/>
-        </w:rPr>
-        <w:t>Redux</w:t>
-      </w:r>
-      <w:proofErr w:type="spellEnd"/>
-      <w:r>
-        <w:rPr>
-          <w:rFonts w:ascii="Arial" w:hAnsi="Arial" w:cs="Arial"/>
-          <w:sz w:val="32"/>
-          <w:szCs w:val="32"/>
-          <w:lang w:val="en-US"/>
-        </w:rPr>
-        <w:t xml:space="preserve"> Toolkit • SCSS • HTML • CSS • </w:t>
+      <w:r>
+        <w:rPr>
+          <w:rFonts w:ascii="Arial" w:hAnsi="Arial" w:cs="Arial"/>
+          <w:sz w:val="32"/>
+          <w:szCs w:val="32"/>
+          <w:lang w:val="en-US"/>
+        </w:rPr>
+        <w:t xml:space="preserve"> • HTML • CSS • </w:t>
       </w:r>
       <w:proofErr w:type="spellStart"/>
       <w:r>

</xml_diff>